<commit_message>
feat: publish updated website
</commit_message>
<xml_diff>
--- a/dist/Parth_Resume.docx
+++ b/dist/Parth_Resume.docx
@@ -814,13 +814,6 @@
         </w:rPr>
         <w:t xml:space="preserve"> ensuring brand consistency through a verified API-driven deployment to personal SaaS platforms.</w:t>
       </w:r>
-    </w:p>
-    <w:p>
-      <w:pPr>
-        <w:rPr>
-          <w:rFonts w:ascii="Calibri" w:hAnsi="Calibri" w:cs="Calibri"/>
-        </w:rPr>
-      </w:pPr>
     </w:p>
     <w:sectPr>
       <w:pgSz w:w="12240" w:h="15840"/>
@@ -5240,6 +5233,7 @@
   <w:style w:type="character" w:default="1" w:styleId="DefaultParagraphFont">
     <w:name w:val="Default Paragraph Font"/>
     <w:uiPriority w:val="1"/>
+    <w:semiHidden/>
     <w:unhideWhenUsed/>
   </w:style>
   <w:style w:type="table" w:default="1" w:styleId="TableNormal">

</xml_diff>